<commit_message>
feat: add relevant screenshots
</commit_message>
<xml_diff>
--- a/lab-1/Звіт_Лаб1_ІМ-55_Присяжний.docx
+++ b/lab-1/Звіт_Лаб1_ІМ-55_Присяжний.docx
@@ -192,17 +192,7 @@
               </w:rPr>
               <w:t>Перевірив:</w:t>
               <w:br/>
-            </w:r>
-            <w:r>
-              <w:rPr>
-                <w:sz w:val="26"/>
-              </w:rPr>
               <w:t>Рекечинський Д. О.</w:t>
-            </w:r>
-            <w:r>
-              <w:rPr>
-                <w:sz w:val="26"/>
-              </w:rPr>
               <w:br/>
               <w:br/>
             </w:r>
@@ -2145,44 +2135,6 @@
       </w:pPr>
       <w:r>
         <w:rPr/>
-        <w:drawing>
-          <wp:inline distT="0" distB="0" distL="0" distR="0">
-            <wp:extent cx="5120640" cy="3853180"/>
-            <wp:effectExtent l="0" t="0" r="0" b="0"/>
-            <wp:docPr id="2" name="Picture 2"/>
-            <wp:cNvGraphicFramePr>
-              <a:graphicFrameLocks xmlns:a="http://schemas.openxmlformats.org/drawingml/2006/main" noChangeAspect="1"/>
-            </wp:cNvGraphicFramePr>
-            <a:graphic xmlns:a="http://schemas.openxmlformats.org/drawingml/2006/main">
-              <a:graphicData uri="http://schemas.openxmlformats.org/drawingml/2006/picture">
-                <pic:pic xmlns:pic="http://schemas.openxmlformats.org/drawingml/2006/picture">
-                  <pic:nvPicPr>
-                    <pic:cNvPr id="2" name="Picture 2"/>
-                    <pic:cNvPicPr>
-                      <a:picLocks noChangeAspect="1" noChangeArrowheads="1"/>
-                    </pic:cNvPicPr>
-                  </pic:nvPicPr>
-                  <pic:blipFill>
-                    <a:blip r:embed="rId3"/>
-                    <a:stretch>
-                      <a:fillRect/>
-                    </a:stretch>
-                  </pic:blipFill>
-                  <pic:spPr bwMode="auto">
-                    <a:xfrm>
-                      <a:off x="0" y="0"/>
-                      <a:ext cx="5120640" cy="3853180"/>
-                    </a:xfrm>
-                    <a:prstGeom prst="rect">
-                      <a:avLst/>
-                    </a:prstGeom>
-                    <a:noFill/>
-                  </pic:spPr>
-                </pic:pic>
-              </a:graphicData>
-            </a:graphic>
-          </wp:inline>
-        </w:drawing>
       </w:r>
     </w:p>
     <w:p>
@@ -2226,6 +2178,52 @@
       </w:pPr>
       <w:r>
         <w:rPr/>
+        <w:drawing>
+          <wp:anchor distT="0" distB="0" distL="0" distR="0" simplePos="0" relativeHeight="3" behindDoc="0" locked="0" layoutInCell="0" allowOverlap="1">
+            <wp:simplePos x="0" y="0"/>
+            <wp:positionH relativeFrom="column">
+              <wp:align>center</wp:align>
+            </wp:positionH>
+            <wp:positionV relativeFrom="paragraph">
+              <wp:posOffset>635</wp:posOffset>
+            </wp:positionV>
+            <wp:extent cx="6336665" cy="4525645"/>
+            <wp:effectExtent l="0" t="0" r="0" b="0"/>
+            <wp:wrapSquare wrapText="largest"/>
+            <wp:docPr id="2" name="Image1"/>
+            <wp:cNvGraphicFramePr>
+              <a:graphicFrameLocks xmlns:a="http://schemas.openxmlformats.org/drawingml/2006/main" noChangeAspect="1"/>
+            </wp:cNvGraphicFramePr>
+            <a:graphic xmlns:a="http://schemas.openxmlformats.org/drawingml/2006/main">
+              <a:graphicData uri="http://schemas.openxmlformats.org/drawingml/2006/picture">
+                <pic:pic xmlns:pic="http://schemas.openxmlformats.org/drawingml/2006/picture">
+                  <pic:nvPicPr>
+                    <pic:cNvPr id="2" name="Image1"/>
+                    <pic:cNvPicPr>
+                      <a:picLocks noChangeAspect="1" noChangeArrowheads="1"/>
+                    </pic:cNvPicPr>
+                  </pic:nvPicPr>
+                  <pic:blipFill>
+                    <a:blip r:embed="rId3"/>
+                    <a:stretch>
+                      <a:fillRect/>
+                    </a:stretch>
+                  </pic:blipFill>
+                  <pic:spPr bwMode="auto">
+                    <a:xfrm>
+                      <a:off x="0" y="0"/>
+                      <a:ext cx="6336665" cy="4525645"/>
+                    </a:xfrm>
+                    <a:prstGeom prst="rect">
+                      <a:avLst/>
+                    </a:prstGeom>
+                    <a:noFill/>
+                  </pic:spPr>
+                </pic:pic>
+              </a:graphicData>
+            </a:graphic>
+          </wp:anchor>
+        </w:drawing>
       </w:r>
       <w:r>
         <w:br w:type="page"/>
@@ -2235,7 +2233,171 @@
       <w:pPr>
         <w:pStyle w:val="Normal"/>
         <w:spacing w:before="0" w:after="120"/>
-        <w:rPr/>
+        <w:rPr>
+          <w:b/>
+          <w:sz w:val="28"/>
+        </w:rPr>
+      </w:pPr>
+      <w:r>
+        <w:rPr>
+          <w:b/>
+          <w:sz w:val="28"/>
+        </w:rPr>
+        <w:drawing>
+          <wp:anchor distT="0" distB="0" distL="0" distR="0" simplePos="0" relativeHeight="4" behindDoc="0" locked="0" layoutInCell="0" allowOverlap="1">
+            <wp:simplePos x="0" y="0"/>
+            <wp:positionH relativeFrom="column">
+              <wp:align>center</wp:align>
+            </wp:positionH>
+            <wp:positionV relativeFrom="paragraph">
+              <wp:posOffset>635</wp:posOffset>
+            </wp:positionV>
+            <wp:extent cx="6336665" cy="4525645"/>
+            <wp:effectExtent l="0" t="0" r="0" b="0"/>
+            <wp:wrapSquare wrapText="largest"/>
+            <wp:docPr id="3" name="Image2"/>
+            <wp:cNvGraphicFramePr>
+              <a:graphicFrameLocks xmlns:a="http://schemas.openxmlformats.org/drawingml/2006/main" noChangeAspect="1"/>
+            </wp:cNvGraphicFramePr>
+            <a:graphic xmlns:a="http://schemas.openxmlformats.org/drawingml/2006/main">
+              <a:graphicData uri="http://schemas.openxmlformats.org/drawingml/2006/picture">
+                <pic:pic xmlns:pic="http://schemas.openxmlformats.org/drawingml/2006/picture">
+                  <pic:nvPicPr>
+                    <pic:cNvPr id="3" name="Image2"/>
+                    <pic:cNvPicPr>
+                      <a:picLocks noChangeAspect="1" noChangeArrowheads="1"/>
+                    </pic:cNvPicPr>
+                  </pic:nvPicPr>
+                  <pic:blipFill>
+                    <a:blip r:embed="rId4"/>
+                    <a:stretch>
+                      <a:fillRect/>
+                    </a:stretch>
+                  </pic:blipFill>
+                  <pic:spPr bwMode="auto">
+                    <a:xfrm>
+                      <a:off x="0" y="0"/>
+                      <a:ext cx="6336665" cy="4525645"/>
+                    </a:xfrm>
+                    <a:prstGeom prst="rect">
+                      <a:avLst/>
+                    </a:prstGeom>
+                    <a:noFill/>
+                  </pic:spPr>
+                </pic:pic>
+              </a:graphicData>
+            </a:graphic>
+          </wp:anchor>
+        </w:drawing>
+        <w:drawing>
+          <wp:anchor distT="0" distB="0" distL="0" distR="0" simplePos="0" relativeHeight="5" behindDoc="0" locked="0" layoutInCell="0" allowOverlap="1">
+            <wp:simplePos x="0" y="0"/>
+            <wp:positionH relativeFrom="column">
+              <wp:align>center</wp:align>
+            </wp:positionH>
+            <wp:positionV relativeFrom="paragraph">
+              <wp:posOffset>635</wp:posOffset>
+            </wp:positionV>
+            <wp:extent cx="6336665" cy="4525645"/>
+            <wp:effectExtent l="0" t="0" r="0" b="0"/>
+            <wp:wrapSquare wrapText="largest"/>
+            <wp:docPr id="4" name="Image3"/>
+            <wp:cNvGraphicFramePr>
+              <a:graphicFrameLocks xmlns:a="http://schemas.openxmlformats.org/drawingml/2006/main" noChangeAspect="1"/>
+            </wp:cNvGraphicFramePr>
+            <a:graphic xmlns:a="http://schemas.openxmlformats.org/drawingml/2006/main">
+              <a:graphicData uri="http://schemas.openxmlformats.org/drawingml/2006/picture">
+                <pic:pic xmlns:pic="http://schemas.openxmlformats.org/drawingml/2006/picture">
+                  <pic:nvPicPr>
+                    <pic:cNvPr id="4" name="Image3"/>
+                    <pic:cNvPicPr>
+                      <a:picLocks noChangeAspect="1" noChangeArrowheads="1"/>
+                    </pic:cNvPicPr>
+                  </pic:nvPicPr>
+                  <pic:blipFill>
+                    <a:blip r:embed="rId5"/>
+                    <a:stretch>
+                      <a:fillRect/>
+                    </a:stretch>
+                  </pic:blipFill>
+                  <pic:spPr bwMode="auto">
+                    <a:xfrm>
+                      <a:off x="0" y="0"/>
+                      <a:ext cx="6336665" cy="4525645"/>
+                    </a:xfrm>
+                    <a:prstGeom prst="rect">
+                      <a:avLst/>
+                    </a:prstGeom>
+                    <a:noFill/>
+                  </pic:spPr>
+                </pic:pic>
+              </a:graphicData>
+            </a:graphic>
+          </wp:anchor>
+        </w:drawing>
+        <w:drawing>
+          <wp:anchor distT="0" distB="0" distL="0" distR="0" simplePos="0" relativeHeight="6" behindDoc="0" locked="0" layoutInCell="0" allowOverlap="1">
+            <wp:simplePos x="0" y="0"/>
+            <wp:positionH relativeFrom="column">
+              <wp:align>center</wp:align>
+            </wp:positionH>
+            <wp:positionV relativeFrom="paragraph">
+              <wp:posOffset>635</wp:posOffset>
+            </wp:positionV>
+            <wp:extent cx="6336665" cy="4525645"/>
+            <wp:effectExtent l="0" t="0" r="0" b="0"/>
+            <wp:wrapSquare wrapText="largest"/>
+            <wp:docPr id="5" name="Image4"/>
+            <wp:cNvGraphicFramePr>
+              <a:graphicFrameLocks xmlns:a="http://schemas.openxmlformats.org/drawingml/2006/main" noChangeAspect="1"/>
+            </wp:cNvGraphicFramePr>
+            <a:graphic xmlns:a="http://schemas.openxmlformats.org/drawingml/2006/main">
+              <a:graphicData uri="http://schemas.openxmlformats.org/drawingml/2006/picture">
+                <pic:pic xmlns:pic="http://schemas.openxmlformats.org/drawingml/2006/picture">
+                  <pic:nvPicPr>
+                    <pic:cNvPr id="5" name="Image4"/>
+                    <pic:cNvPicPr>
+                      <a:picLocks noChangeAspect="1" noChangeArrowheads="1"/>
+                    </pic:cNvPicPr>
+                  </pic:nvPicPr>
+                  <pic:blipFill>
+                    <a:blip r:embed="rId6"/>
+                    <a:stretch>
+                      <a:fillRect/>
+                    </a:stretch>
+                  </pic:blipFill>
+                  <pic:spPr bwMode="auto">
+                    <a:xfrm>
+                      <a:off x="0" y="0"/>
+                      <a:ext cx="6336665" cy="4525645"/>
+                    </a:xfrm>
+                    <a:prstGeom prst="rect">
+                      <a:avLst/>
+                    </a:prstGeom>
+                    <a:noFill/>
+                  </pic:spPr>
+                </pic:pic>
+              </a:graphicData>
+            </a:graphic>
+          </wp:anchor>
+        </w:drawing>
+      </w:r>
+      <w:r>
+        <w:rPr>
+          <w:b/>
+          <w:sz w:val="28"/>
+        </w:rPr>
+        <w:tab/>
+      </w:r>
+    </w:p>
+    <w:p>
+      <w:pPr>
+        <w:pStyle w:val="Normal"/>
+        <w:spacing w:before="0" w:after="120"/>
+        <w:rPr>
+          <w:b/>
+          <w:sz w:val="28"/>
+        </w:rPr>
       </w:pPr>
       <w:r>
         <w:rPr>
@@ -2313,6 +2475,7 @@
         </w:tabs>
         <w:ind w:start="1080" w:hanging="360"/>
       </w:pPr>
+      <w:rPr/>
     </w:lvl>
     <w:lvl w:ilvl="2">
       <w:start w:val="1"/>
@@ -2325,6 +2488,7 @@
         </w:tabs>
         <w:ind w:start="1440" w:hanging="360"/>
       </w:pPr>
+      <w:rPr/>
     </w:lvl>
     <w:lvl w:ilvl="3">
       <w:start w:val="1"/>
@@ -2337,6 +2501,7 @@
         </w:tabs>
         <w:ind w:start="1800" w:hanging="360"/>
       </w:pPr>
+      <w:rPr/>
     </w:lvl>
     <w:lvl w:ilvl="4">
       <w:start w:val="1"/>
@@ -2349,6 +2514,7 @@
         </w:tabs>
         <w:ind w:start="2160" w:hanging="360"/>
       </w:pPr>
+      <w:rPr/>
     </w:lvl>
     <w:lvl w:ilvl="5">
       <w:start w:val="1"/>
@@ -2361,6 +2527,7 @@
         </w:tabs>
         <w:ind w:start="2520" w:hanging="360"/>
       </w:pPr>
+      <w:rPr/>
     </w:lvl>
     <w:lvl w:ilvl="6">
       <w:start w:val="1"/>
@@ -2373,6 +2540,7 @@
         </w:tabs>
         <w:ind w:start="2880" w:hanging="360"/>
       </w:pPr>
+      <w:rPr/>
     </w:lvl>
     <w:lvl w:ilvl="7">
       <w:start w:val="1"/>
@@ -2385,6 +2553,7 @@
         </w:tabs>
         <w:ind w:start="3240" w:hanging="360"/>
       </w:pPr>
+      <w:rPr/>
     </w:lvl>
     <w:lvl w:ilvl="8">
       <w:start w:val="1"/>
@@ -2397,6 +2566,7 @@
         </w:tabs>
         <w:ind w:start="3600" w:hanging="360"/>
       </w:pPr>
+      <w:rPr/>
     </w:lvl>
   </w:abstractNum>
   <w:abstractNum w:abstractNumId="2">
@@ -2426,6 +2596,7 @@
         </w:tabs>
         <w:ind w:start="1080" w:hanging="360"/>
       </w:pPr>
+      <w:rPr/>
     </w:lvl>
     <w:lvl w:ilvl="2">
       <w:start w:val="1"/>
@@ -2438,6 +2609,7 @@
         </w:tabs>
         <w:ind w:start="1440" w:hanging="360"/>
       </w:pPr>
+      <w:rPr/>
     </w:lvl>
     <w:lvl w:ilvl="3">
       <w:start w:val="1"/>
@@ -2450,6 +2622,7 @@
         </w:tabs>
         <w:ind w:start="1800" w:hanging="360"/>
       </w:pPr>
+      <w:rPr/>
     </w:lvl>
     <w:lvl w:ilvl="4">
       <w:start w:val="1"/>
@@ -2462,6 +2635,7 @@
         </w:tabs>
         <w:ind w:start="2160" w:hanging="360"/>
       </w:pPr>
+      <w:rPr/>
     </w:lvl>
     <w:lvl w:ilvl="5">
       <w:start w:val="1"/>
@@ -2474,6 +2648,7 @@
         </w:tabs>
         <w:ind w:start="2520" w:hanging="360"/>
       </w:pPr>
+      <w:rPr/>
     </w:lvl>
     <w:lvl w:ilvl="6">
       <w:start w:val="1"/>
@@ -2486,6 +2661,7 @@
         </w:tabs>
         <w:ind w:start="2880" w:hanging="360"/>
       </w:pPr>
+      <w:rPr/>
     </w:lvl>
     <w:lvl w:ilvl="7">
       <w:start w:val="1"/>
@@ -2498,6 +2674,7 @@
         </w:tabs>
         <w:ind w:start="3240" w:hanging="360"/>
       </w:pPr>
+      <w:rPr/>
     </w:lvl>
     <w:lvl w:ilvl="8">
       <w:start w:val="1"/>
@@ -2510,6 +2687,7 @@
         </w:tabs>
         <w:ind w:start="3600" w:hanging="360"/>
       </w:pPr>
+      <w:rPr/>
     </w:lvl>
   </w:abstractNum>
   <w:abstractNum w:abstractNumId="3">
@@ -2539,6 +2717,7 @@
         </w:tabs>
         <w:ind w:start="1080" w:hanging="360"/>
       </w:pPr>
+      <w:rPr/>
     </w:lvl>
     <w:lvl w:ilvl="2">
       <w:start w:val="1"/>
@@ -2551,6 +2730,7 @@
         </w:tabs>
         <w:ind w:start="1440" w:hanging="360"/>
       </w:pPr>
+      <w:rPr/>
     </w:lvl>
     <w:lvl w:ilvl="3">
       <w:start w:val="1"/>
@@ -2563,6 +2743,7 @@
         </w:tabs>
         <w:ind w:start="1800" w:hanging="360"/>
       </w:pPr>
+      <w:rPr/>
     </w:lvl>
     <w:lvl w:ilvl="4">
       <w:start w:val="1"/>
@@ -2575,6 +2756,7 @@
         </w:tabs>
         <w:ind w:start="2160" w:hanging="360"/>
       </w:pPr>
+      <w:rPr/>
     </w:lvl>
     <w:lvl w:ilvl="5">
       <w:start w:val="1"/>
@@ -2587,6 +2769,7 @@
         </w:tabs>
         <w:ind w:start="2520" w:hanging="360"/>
       </w:pPr>
+      <w:rPr/>
     </w:lvl>
     <w:lvl w:ilvl="6">
       <w:start w:val="1"/>
@@ -2599,6 +2782,7 @@
         </w:tabs>
         <w:ind w:start="2880" w:hanging="360"/>
       </w:pPr>
+      <w:rPr/>
     </w:lvl>
     <w:lvl w:ilvl="7">
       <w:start w:val="1"/>
@@ -2611,6 +2795,7 @@
         </w:tabs>
         <w:ind w:start="3240" w:hanging="360"/>
       </w:pPr>
+      <w:rPr/>
     </w:lvl>
     <w:lvl w:ilvl="8">
       <w:start w:val="1"/>
@@ -2623,6 +2808,7 @@
         </w:tabs>
         <w:ind w:start="3600" w:hanging="360"/>
       </w:pPr>
+      <w:rPr/>
     </w:lvl>
   </w:abstractNum>
   <w:abstractNum w:abstractNumId="4">
@@ -2650,6 +2836,7 @@
         </w:tabs>
         <w:ind w:start="1080" w:hanging="360"/>
       </w:pPr>
+      <w:rPr/>
     </w:lvl>
     <w:lvl w:ilvl="2">
       <w:start w:val="1"/>
@@ -2662,6 +2849,7 @@
         </w:tabs>
         <w:ind w:start="1440" w:hanging="360"/>
       </w:pPr>
+      <w:rPr/>
     </w:lvl>
     <w:lvl w:ilvl="3">
       <w:start w:val="1"/>
@@ -2674,6 +2862,7 @@
         </w:tabs>
         <w:ind w:start="1800" w:hanging="360"/>
       </w:pPr>
+      <w:rPr/>
     </w:lvl>
     <w:lvl w:ilvl="4">
       <w:start w:val="1"/>
@@ -2686,6 +2875,7 @@
         </w:tabs>
         <w:ind w:start="2160" w:hanging="360"/>
       </w:pPr>
+      <w:rPr/>
     </w:lvl>
     <w:lvl w:ilvl="5">
       <w:start w:val="1"/>
@@ -2698,6 +2888,7 @@
         </w:tabs>
         <w:ind w:start="2520" w:hanging="360"/>
       </w:pPr>
+      <w:rPr/>
     </w:lvl>
     <w:lvl w:ilvl="6">
       <w:start w:val="1"/>
@@ -2710,6 +2901,7 @@
         </w:tabs>
         <w:ind w:start="2880" w:hanging="360"/>
       </w:pPr>
+      <w:rPr/>
     </w:lvl>
     <w:lvl w:ilvl="7">
       <w:start w:val="1"/>
@@ -2722,6 +2914,7 @@
         </w:tabs>
         <w:ind w:start="3240" w:hanging="360"/>
       </w:pPr>
+      <w:rPr/>
     </w:lvl>
     <w:lvl w:ilvl="8">
       <w:start w:val="1"/>
@@ -2734,6 +2927,7 @@
         </w:tabs>
         <w:ind w:start="3600" w:hanging="360"/>
       </w:pPr>
+      <w:rPr/>
     </w:lvl>
   </w:abstractNum>
   <w:abstractNum w:abstractNumId="5">
@@ -2761,6 +2955,7 @@
         </w:tabs>
         <w:ind w:start="1080" w:hanging="360"/>
       </w:pPr>
+      <w:rPr/>
     </w:lvl>
     <w:lvl w:ilvl="2">
       <w:start w:val="1"/>
@@ -2773,6 +2968,7 @@
         </w:tabs>
         <w:ind w:start="1440" w:hanging="360"/>
       </w:pPr>
+      <w:rPr/>
     </w:lvl>
     <w:lvl w:ilvl="3">
       <w:start w:val="1"/>
@@ -2785,6 +2981,7 @@
         </w:tabs>
         <w:ind w:start="1800" w:hanging="360"/>
       </w:pPr>
+      <w:rPr/>
     </w:lvl>
     <w:lvl w:ilvl="4">
       <w:start w:val="1"/>
@@ -2797,6 +2994,7 @@
         </w:tabs>
         <w:ind w:start="2160" w:hanging="360"/>
       </w:pPr>
+      <w:rPr/>
     </w:lvl>
     <w:lvl w:ilvl="5">
       <w:start w:val="1"/>
@@ -2809,6 +3007,7 @@
         </w:tabs>
         <w:ind w:start="2520" w:hanging="360"/>
       </w:pPr>
+      <w:rPr/>
     </w:lvl>
     <w:lvl w:ilvl="6">
       <w:start w:val="1"/>
@@ -2821,6 +3020,7 @@
         </w:tabs>
         <w:ind w:start="2880" w:hanging="360"/>
       </w:pPr>
+      <w:rPr/>
     </w:lvl>
     <w:lvl w:ilvl="7">
       <w:start w:val="1"/>
@@ -2833,6 +3033,7 @@
         </w:tabs>
         <w:ind w:start="3240" w:hanging="360"/>
       </w:pPr>
+      <w:rPr/>
     </w:lvl>
     <w:lvl w:ilvl="8">
       <w:start w:val="1"/>
@@ -2845,6 +3046,7 @@
         </w:tabs>
         <w:ind w:start="3600" w:hanging="360"/>
       </w:pPr>
+      <w:rPr/>
     </w:lvl>
   </w:abstractNum>
   <w:abstractNum w:abstractNumId="6">
@@ -2872,6 +3074,7 @@
         </w:tabs>
         <w:ind w:start="1080" w:hanging="360"/>
       </w:pPr>
+      <w:rPr/>
     </w:lvl>
     <w:lvl w:ilvl="2">
       <w:start w:val="1"/>
@@ -2884,6 +3087,7 @@
         </w:tabs>
         <w:ind w:start="1440" w:hanging="360"/>
       </w:pPr>
+      <w:rPr/>
     </w:lvl>
     <w:lvl w:ilvl="3">
       <w:start w:val="1"/>
@@ -2896,6 +3100,7 @@
         </w:tabs>
         <w:ind w:start="1800" w:hanging="360"/>
       </w:pPr>
+      <w:rPr/>
     </w:lvl>
     <w:lvl w:ilvl="4">
       <w:start w:val="1"/>
@@ -2908,6 +3113,7 @@
         </w:tabs>
         <w:ind w:start="2160" w:hanging="360"/>
       </w:pPr>
+      <w:rPr/>
     </w:lvl>
     <w:lvl w:ilvl="5">
       <w:start w:val="1"/>
@@ -2920,6 +3126,7 @@
         </w:tabs>
         <w:ind w:start="2520" w:hanging="360"/>
       </w:pPr>
+      <w:rPr/>
     </w:lvl>
     <w:lvl w:ilvl="6">
       <w:start w:val="1"/>
@@ -2932,6 +3139,7 @@
         </w:tabs>
         <w:ind w:start="2880" w:hanging="360"/>
       </w:pPr>
+      <w:rPr/>
     </w:lvl>
     <w:lvl w:ilvl="7">
       <w:start w:val="1"/>
@@ -2944,6 +3152,7 @@
         </w:tabs>
         <w:ind w:start="3240" w:hanging="360"/>
       </w:pPr>
+      <w:rPr/>
     </w:lvl>
     <w:lvl w:ilvl="8">
       <w:start w:val="1"/>
@@ -2956,6 +3165,7 @@
         </w:tabs>
         <w:ind w:start="3600" w:hanging="360"/>
       </w:pPr>
+      <w:rPr/>
     </w:lvl>
   </w:abstractNum>
   <w:abstractNum w:abstractNumId="7">
@@ -3106,7 +3316,7 @@
   <w:docDefaults>
     <w:rPrDefault>
       <w:rPr>
-        <w:rFonts w:ascii="Cambria" w:hAnsi="Cambria" w:eastAsia="ＭＳ 明朝" w:cs="" w:asciiTheme="minorHAnsi" w:cstheme="minorBidi" w:eastAsiaTheme="minorEastAsia" w:hAnsiTheme="minorHAnsi"/>
+        <w:rFonts w:ascii="Cambria" w:hAnsi="Cambria" w:eastAsia="" w:cs="" w:asciiTheme="minorHAnsi" w:cstheme="minorBidi" w:eastAsiaTheme="minorEastAsia" w:hAnsiTheme="minorHAnsi"/>
         <w:sz w:val="22"/>
         <w:szCs w:val="22"/>
         <w:lang w:val="en-US" w:eastAsia="en-US" w:bidi="ar-SA"/>
@@ -3263,6 +3473,7 @@
     <w:rsid w:val="00fc693f"/>
     <w:pPr>
       <w:widowControl/>
+      <w:suppressAutoHyphens w:val="true"/>
       <w:bidi w:val="0"/>
       <w:spacing w:lineRule="auto" w:line="276" w:before="0" w:after="80"/>
       <w:jc w:val="start"/>
@@ -3291,7 +3502,7 @@
       <w:outlineLvl w:val="0"/>
     </w:pPr>
     <w:rPr>
-      <w:rFonts w:ascii="Calibri" w:hAnsi="Calibri" w:eastAsia="ＭＳ ゴシック" w:cs="" w:asciiTheme="majorHAnsi" w:cstheme="majorBidi" w:eastAsiaTheme="majorEastAsia" w:hAnsiTheme="majorHAnsi"/>
+      <w:rFonts w:ascii="Calibri" w:hAnsi="Calibri" w:eastAsia="" w:cs="" w:asciiTheme="majorHAnsi" w:cstheme="majorBidi" w:eastAsiaTheme="majorEastAsia" w:hAnsiTheme="majorHAnsi"/>
       <w:b/>
       <w:bCs/>
       <w:color w:themeColor="accent1" w:themeShade="bf" w:val="365F91"/>
@@ -3315,7 +3526,7 @@
       <w:outlineLvl w:val="1"/>
     </w:pPr>
     <w:rPr>
-      <w:rFonts w:ascii="Calibri" w:hAnsi="Calibri" w:eastAsia="ＭＳ ゴシック" w:cs="" w:asciiTheme="majorHAnsi" w:cstheme="majorBidi" w:eastAsiaTheme="majorEastAsia" w:hAnsiTheme="majorHAnsi"/>
+      <w:rFonts w:ascii="Calibri" w:hAnsi="Calibri" w:eastAsia="" w:cs="" w:asciiTheme="majorHAnsi" w:cstheme="majorBidi" w:eastAsiaTheme="majorEastAsia" w:hAnsiTheme="majorHAnsi"/>
       <w:b/>
       <w:bCs/>
       <w:color w:themeColor="accent1" w:val="4F81BD"/>
@@ -3339,7 +3550,7 @@
       <w:outlineLvl w:val="2"/>
     </w:pPr>
     <w:rPr>
-      <w:rFonts w:ascii="Calibri" w:hAnsi="Calibri" w:eastAsia="ＭＳ ゴシック" w:cs="" w:asciiTheme="majorHAnsi" w:cstheme="majorBidi" w:eastAsiaTheme="majorEastAsia" w:hAnsiTheme="majorHAnsi"/>
+      <w:rFonts w:ascii="Calibri" w:hAnsi="Calibri" w:eastAsia="" w:cs="" w:asciiTheme="majorHAnsi" w:cstheme="majorBidi" w:eastAsiaTheme="majorEastAsia" w:hAnsiTheme="majorHAnsi"/>
       <w:b/>
       <w:bCs/>
       <w:color w:themeColor="accent1" w:val="4F81BD"/>
@@ -3362,7 +3573,7 @@
       <w:outlineLvl w:val="3"/>
     </w:pPr>
     <w:rPr>
-      <w:rFonts w:ascii="Calibri" w:hAnsi="Calibri" w:eastAsia="ＭＳ ゴシック" w:cs="" w:asciiTheme="majorHAnsi" w:cstheme="majorBidi" w:eastAsiaTheme="majorEastAsia" w:hAnsiTheme="majorHAnsi"/>
+      <w:rFonts w:ascii="Calibri" w:hAnsi="Calibri" w:eastAsia="" w:cs="" w:asciiTheme="majorHAnsi" w:cstheme="majorBidi" w:eastAsiaTheme="majorEastAsia" w:hAnsiTheme="majorHAnsi"/>
       <w:b/>
       <w:bCs/>
       <w:i/>
@@ -3387,7 +3598,7 @@
       <w:outlineLvl w:val="4"/>
     </w:pPr>
     <w:rPr>
-      <w:rFonts w:ascii="Calibri" w:hAnsi="Calibri" w:eastAsia="ＭＳ ゴシック" w:cs="" w:asciiTheme="majorHAnsi" w:cstheme="majorBidi" w:eastAsiaTheme="majorEastAsia" w:hAnsiTheme="majorHAnsi"/>
+      <w:rFonts w:ascii="Calibri" w:hAnsi="Calibri" w:eastAsia="" w:cs="" w:asciiTheme="majorHAnsi" w:cstheme="majorBidi" w:eastAsiaTheme="majorEastAsia" w:hAnsiTheme="majorHAnsi"/>
       <w:color w:themeColor="accent1" w:themeShade="7f" w:val="243F60"/>
     </w:rPr>
   </w:style>
@@ -3408,7 +3619,7 @@
       <w:outlineLvl w:val="5"/>
     </w:pPr>
     <w:rPr>
-      <w:rFonts w:ascii="Calibri" w:hAnsi="Calibri" w:eastAsia="ＭＳ ゴシック" w:cs="" w:asciiTheme="majorHAnsi" w:cstheme="majorBidi" w:eastAsiaTheme="majorEastAsia" w:hAnsiTheme="majorHAnsi"/>
+      <w:rFonts w:ascii="Calibri" w:hAnsi="Calibri" w:eastAsia="" w:cs="" w:asciiTheme="majorHAnsi" w:cstheme="majorBidi" w:eastAsiaTheme="majorEastAsia" w:hAnsiTheme="majorHAnsi"/>
       <w:i/>
       <w:iCs/>
       <w:color w:themeColor="accent1" w:themeShade="7f" w:val="243F60"/>
@@ -3431,7 +3642,7 @@
       <w:outlineLvl w:val="6"/>
     </w:pPr>
     <w:rPr>
-      <w:rFonts w:ascii="Calibri" w:hAnsi="Calibri" w:eastAsia="ＭＳ ゴシック" w:cs="" w:asciiTheme="majorHAnsi" w:cstheme="majorBidi" w:eastAsiaTheme="majorEastAsia" w:hAnsiTheme="majorHAnsi"/>
+      <w:rFonts w:ascii="Calibri" w:hAnsi="Calibri" w:eastAsia="" w:cs="" w:asciiTheme="majorHAnsi" w:cstheme="majorBidi" w:eastAsiaTheme="majorEastAsia" w:hAnsiTheme="majorHAnsi"/>
       <w:i/>
       <w:iCs/>
       <w:color w:themeColor="text1" w:themeTint="bf" w:val="404040"/>
@@ -3454,7 +3665,7 @@
       <w:outlineLvl w:val="7"/>
     </w:pPr>
     <w:rPr>
-      <w:rFonts w:ascii="Calibri" w:hAnsi="Calibri" w:eastAsia="ＭＳ ゴシック" w:cs="" w:asciiTheme="majorHAnsi" w:cstheme="majorBidi" w:eastAsiaTheme="majorEastAsia" w:hAnsiTheme="majorHAnsi"/>
+      <w:rFonts w:ascii="Calibri" w:hAnsi="Calibri" w:eastAsia="" w:cs="" w:asciiTheme="majorHAnsi" w:cstheme="majorBidi" w:eastAsiaTheme="majorEastAsia" w:hAnsiTheme="majorHAnsi"/>
       <w:color w:themeColor="accent1" w:val="4F81BD"/>
       <w:sz w:val="20"/>
       <w:szCs w:val="20"/>
@@ -3477,7 +3688,7 @@
       <w:outlineLvl w:val="8"/>
     </w:pPr>
     <w:rPr>
-      <w:rFonts w:ascii="Calibri" w:hAnsi="Calibri" w:eastAsia="ＭＳ ゴシック" w:cs="" w:asciiTheme="majorHAnsi" w:cstheme="majorBidi" w:eastAsiaTheme="majorEastAsia" w:hAnsiTheme="majorHAnsi"/>
+      <w:rFonts w:ascii="Calibri" w:hAnsi="Calibri" w:eastAsia="" w:cs="" w:asciiTheme="majorHAnsi" w:cstheme="majorBidi" w:eastAsiaTheme="majorEastAsia" w:hAnsiTheme="majorHAnsi"/>
       <w:i/>
       <w:iCs/>
       <w:color w:themeColor="text1" w:themeTint="bf" w:val="404040"/>
@@ -3519,7 +3730,7 @@
     <w:qFormat/>
     <w:rsid w:val="00fc693f"/>
     <w:rPr>
-      <w:rFonts w:ascii="Calibri" w:hAnsi="Calibri" w:eastAsia="ＭＳ ゴシック" w:cs="" w:asciiTheme="majorHAnsi" w:cstheme="majorBidi" w:eastAsiaTheme="majorEastAsia" w:hAnsiTheme="majorHAnsi"/>
+      <w:rFonts w:ascii="Calibri" w:hAnsi="Calibri" w:eastAsia="" w:cs="" w:asciiTheme="majorHAnsi" w:cstheme="majorBidi" w:eastAsiaTheme="majorEastAsia" w:hAnsiTheme="majorHAnsi"/>
       <w:b/>
       <w:bCs/>
       <w:color w:themeColor="accent1" w:themeShade="bf" w:val="365F91"/>
@@ -3535,7 +3746,7 @@
     <w:qFormat/>
     <w:rsid w:val="00fc693f"/>
     <w:rPr>
-      <w:rFonts w:ascii="Calibri" w:hAnsi="Calibri" w:eastAsia="ＭＳ ゴシック" w:cs="" w:asciiTheme="majorHAnsi" w:cstheme="majorBidi" w:eastAsiaTheme="majorEastAsia" w:hAnsiTheme="majorHAnsi"/>
+      <w:rFonts w:ascii="Calibri" w:hAnsi="Calibri" w:eastAsia="" w:cs="" w:asciiTheme="majorHAnsi" w:cstheme="majorBidi" w:eastAsiaTheme="majorEastAsia" w:hAnsiTheme="majorHAnsi"/>
       <w:b/>
       <w:bCs/>
       <w:color w:themeColor="accent1" w:val="4F81BD"/>
@@ -3551,7 +3762,7 @@
     <w:qFormat/>
     <w:rsid w:val="00fc693f"/>
     <w:rPr>
-      <w:rFonts w:ascii="Calibri" w:hAnsi="Calibri" w:eastAsia="ＭＳ ゴシック" w:cs="" w:asciiTheme="majorHAnsi" w:cstheme="majorBidi" w:eastAsiaTheme="majorEastAsia" w:hAnsiTheme="majorHAnsi"/>
+      <w:rFonts w:ascii="Calibri" w:hAnsi="Calibri" w:eastAsia="" w:cs="" w:asciiTheme="majorHAnsi" w:cstheme="majorBidi" w:eastAsiaTheme="majorEastAsia" w:hAnsiTheme="majorHAnsi"/>
       <w:b/>
       <w:bCs/>
       <w:color w:themeColor="accent1" w:val="4F81BD"/>
@@ -3565,7 +3776,7 @@
     <w:qFormat/>
     <w:rsid w:val="00fc693f"/>
     <w:rPr>
-      <w:rFonts w:ascii="Calibri" w:hAnsi="Calibri" w:eastAsia="ＭＳ ゴシック" w:cs="" w:asciiTheme="majorHAnsi" w:cstheme="majorBidi" w:eastAsiaTheme="majorEastAsia" w:hAnsiTheme="majorHAnsi"/>
+      <w:rFonts w:ascii="Calibri" w:hAnsi="Calibri" w:eastAsia="" w:cs="" w:asciiTheme="majorHAnsi" w:cstheme="majorBidi" w:eastAsiaTheme="majorEastAsia" w:hAnsiTheme="majorHAnsi"/>
       <w:color w:themeColor="text2" w:themeShade="bf" w:val="17365D"/>
       <w:spacing w:val="5"/>
       <w:kern w:val="2"/>
@@ -3581,7 +3792,7 @@
     <w:qFormat/>
     <w:rsid w:val="00fc693f"/>
     <w:rPr>
-      <w:rFonts w:ascii="Calibri" w:hAnsi="Calibri" w:eastAsia="ＭＳ ゴシック" w:cs="" w:asciiTheme="majorHAnsi" w:cstheme="majorBidi" w:eastAsiaTheme="majorEastAsia" w:hAnsiTheme="majorHAnsi"/>
+      <w:rFonts w:ascii="Calibri" w:hAnsi="Calibri" w:eastAsia="" w:cs="" w:asciiTheme="majorHAnsi" w:cstheme="majorBidi" w:eastAsiaTheme="majorEastAsia" w:hAnsiTheme="majorHAnsi"/>
       <w:i/>
       <w:iCs/>
       <w:color w:themeColor="accent1" w:val="4F81BD"/>
@@ -3654,7 +3865,7 @@
     <w:qFormat/>
     <w:rsid w:val="00fc693f"/>
     <w:rPr>
-      <w:rFonts w:ascii="Calibri" w:hAnsi="Calibri" w:eastAsia="ＭＳ ゴシック" w:cs="" w:asciiTheme="majorHAnsi" w:cstheme="majorBidi" w:eastAsiaTheme="majorEastAsia" w:hAnsiTheme="majorHAnsi"/>
+      <w:rFonts w:ascii="Calibri" w:hAnsi="Calibri" w:eastAsia="" w:cs="" w:asciiTheme="majorHAnsi" w:cstheme="majorBidi" w:eastAsiaTheme="majorEastAsia" w:hAnsiTheme="majorHAnsi"/>
       <w:b/>
       <w:bCs/>
       <w:i/>
@@ -3671,7 +3882,7 @@
     <w:qFormat/>
     <w:rsid w:val="00fc693f"/>
     <w:rPr>
-      <w:rFonts w:ascii="Calibri" w:hAnsi="Calibri" w:eastAsia="ＭＳ ゴシック" w:cs="" w:asciiTheme="majorHAnsi" w:cstheme="majorBidi" w:eastAsiaTheme="majorEastAsia" w:hAnsiTheme="majorHAnsi"/>
+      <w:rFonts w:ascii="Calibri" w:hAnsi="Calibri" w:eastAsia="" w:cs="" w:asciiTheme="majorHAnsi" w:cstheme="majorBidi" w:eastAsiaTheme="majorEastAsia" w:hAnsiTheme="majorHAnsi"/>
       <w:color w:themeColor="accent1" w:themeShade="7f" w:val="243F60"/>
     </w:rPr>
   </w:style>
@@ -3684,7 +3895,7 @@
     <w:qFormat/>
     <w:rsid w:val="00fc693f"/>
     <w:rPr>
-      <w:rFonts w:ascii="Calibri" w:hAnsi="Calibri" w:eastAsia="ＭＳ ゴシック" w:cs="" w:asciiTheme="majorHAnsi" w:cstheme="majorBidi" w:eastAsiaTheme="majorEastAsia" w:hAnsiTheme="majorHAnsi"/>
+      <w:rFonts w:ascii="Calibri" w:hAnsi="Calibri" w:eastAsia="" w:cs="" w:asciiTheme="majorHAnsi" w:cstheme="majorBidi" w:eastAsiaTheme="majorEastAsia" w:hAnsiTheme="majorHAnsi"/>
       <w:i/>
       <w:iCs/>
       <w:color w:themeColor="accent1" w:themeShade="7f" w:val="243F60"/>
@@ -3699,7 +3910,7 @@
     <w:qFormat/>
     <w:rsid w:val="00fc693f"/>
     <w:rPr>
-      <w:rFonts w:ascii="Calibri" w:hAnsi="Calibri" w:eastAsia="ＭＳ ゴシック" w:cs="" w:asciiTheme="majorHAnsi" w:cstheme="majorBidi" w:eastAsiaTheme="majorEastAsia" w:hAnsiTheme="majorHAnsi"/>
+      <w:rFonts w:ascii="Calibri" w:hAnsi="Calibri" w:eastAsia="" w:cs="" w:asciiTheme="majorHAnsi" w:cstheme="majorBidi" w:eastAsiaTheme="majorEastAsia" w:hAnsiTheme="majorHAnsi"/>
       <w:i/>
       <w:iCs/>
       <w:color w:themeColor="text1" w:themeTint="bf" w:val="404040"/>
@@ -3714,7 +3925,7 @@
     <w:qFormat/>
     <w:rsid w:val="00fc693f"/>
     <w:rPr>
-      <w:rFonts w:ascii="Calibri" w:hAnsi="Calibri" w:eastAsia="ＭＳ ゴシック" w:cs="" w:asciiTheme="majorHAnsi" w:cstheme="majorBidi" w:eastAsiaTheme="majorEastAsia" w:hAnsiTheme="majorHAnsi"/>
+      <w:rFonts w:ascii="Calibri" w:hAnsi="Calibri" w:eastAsia="" w:cs="" w:asciiTheme="majorHAnsi" w:cstheme="majorBidi" w:eastAsiaTheme="majorEastAsia" w:hAnsiTheme="majorHAnsi"/>
       <w:color w:themeColor="accent1" w:val="4F81BD"/>
       <w:sz w:val="20"/>
       <w:szCs w:val="20"/>
@@ -3729,7 +3940,7 @@
     <w:qFormat/>
     <w:rsid w:val="00fc693f"/>
     <w:rPr>
-      <w:rFonts w:ascii="Calibri" w:hAnsi="Calibri" w:eastAsia="ＭＳ ゴシック" w:cs="" w:asciiTheme="majorHAnsi" w:cstheme="majorBidi" w:eastAsiaTheme="majorEastAsia" w:hAnsiTheme="majorHAnsi"/>
+      <w:rFonts w:ascii="Calibri" w:hAnsi="Calibri" w:eastAsia="" w:cs="" w:asciiTheme="majorHAnsi" w:cstheme="majorBidi" w:eastAsiaTheme="majorEastAsia" w:hAnsiTheme="majorHAnsi"/>
       <w:i/>
       <w:iCs/>
       <w:color w:themeColor="text1" w:themeTint="bf" w:val="404040"/>
@@ -3959,12 +4170,13 @@
     <w:rsid w:val="00fc693f"/>
     <w:pPr>
       <w:widowControl/>
+      <w:suppressAutoHyphens w:val="true"/>
       <w:bidi w:val="0"/>
       <w:spacing w:lineRule="auto" w:line="240" w:before="0" w:after="0"/>
       <w:jc w:val="start"/>
     </w:pPr>
     <w:rPr>
-      <w:rFonts w:ascii="Cambria" w:hAnsi="Cambria" w:eastAsia="ＭＳ 明朝" w:cs="" w:asciiTheme="minorHAnsi" w:cstheme="minorBidi" w:eastAsiaTheme="minorEastAsia" w:hAnsiTheme="minorHAnsi"/>
+      <w:rFonts w:ascii="Cambria" w:hAnsi="Cambria" w:eastAsia="" w:cs="" w:asciiTheme="minorHAnsi" w:cstheme="minorBidi" w:eastAsiaTheme="minorEastAsia" w:hAnsiTheme="minorHAnsi"/>
       <w:color w:val="auto"/>
       <w:kern w:val="0"/>
       <w:sz w:val="22"/>
@@ -3988,7 +4200,7 @@
       <w:contextualSpacing/>
     </w:pPr>
     <w:rPr>
-      <w:rFonts w:ascii="Calibri" w:hAnsi="Calibri" w:eastAsia="ＭＳ ゴシック" w:cs="" w:asciiTheme="majorHAnsi" w:cstheme="majorBidi" w:eastAsiaTheme="majorEastAsia" w:hAnsiTheme="majorHAnsi"/>
+      <w:rFonts w:ascii="Calibri" w:hAnsi="Calibri" w:eastAsia="" w:cs="" w:asciiTheme="majorHAnsi" w:cstheme="majorBidi" w:eastAsiaTheme="majorEastAsia" w:hAnsiTheme="majorHAnsi"/>
       <w:color w:themeColor="text2" w:themeShade="bf" w:val="17365D"/>
       <w:spacing w:val="5"/>
       <w:kern w:val="2"/>
@@ -4006,7 +4218,7 @@
     <w:rsid w:val="00fc693f"/>
     <w:pPr/>
     <w:rPr>
-      <w:rFonts w:ascii="Calibri" w:hAnsi="Calibri" w:eastAsia="ＭＳ ゴシック" w:cs="" w:asciiTheme="majorHAnsi" w:cstheme="majorBidi" w:eastAsiaTheme="majorEastAsia" w:hAnsiTheme="majorHAnsi"/>
+      <w:rFonts w:ascii="Calibri" w:hAnsi="Calibri" w:eastAsia="" w:cs="" w:asciiTheme="majorHAnsi" w:cstheme="majorBidi" w:eastAsiaTheme="majorEastAsia" w:hAnsiTheme="majorHAnsi"/>
       <w:i/>
       <w:iCs/>
       <w:color w:themeColor="accent1" w:val="4F81BD"/>
@@ -4239,12 +4451,13 @@
         <w:tab w:val="left" w:pos="3456" w:leader="none"/>
         <w:tab w:val="left" w:pos="4032" w:leader="none"/>
       </w:tabs>
+      <w:suppressAutoHyphens w:val="true"/>
       <w:bidi w:val="0"/>
       <w:spacing w:lineRule="auto" w:line="276" w:before="0" w:after="200"/>
       <w:jc w:val="start"/>
     </w:pPr>
     <w:rPr>
-      <w:rFonts w:ascii="Courier" w:hAnsi="Courier" w:eastAsia="ＭＳ 明朝" w:cs="" w:cstheme="minorBidi" w:eastAsiaTheme="minorEastAsia"/>
+      <w:rFonts w:ascii="Courier" w:hAnsi="Courier" w:eastAsia="" w:cs="" w:cstheme="minorBidi" w:eastAsiaTheme="minorEastAsia"/>
       <w:color w:val="auto"/>
       <w:kern w:val="0"/>
       <w:sz w:val="20"/>
@@ -7442,7 +7655,6 @@
       <w:pPr>
         <w:spacing w:before="0" w:after="0" w:line="240" w:lineRule="auto"/>
       </w:pPr>
-      <w:rPr/>
       <w:tblPr/>
       <w:tcPr>
         <w:tcBorders>
@@ -7588,7 +7800,6 @@
       <w:pPr>
         <w:spacing w:before="0" w:after="0" w:line="240" w:lineRule="auto"/>
       </w:pPr>
-      <w:rPr/>
       <w:tblPr/>
       <w:tcPr>
         <w:tcBorders>
@@ -7734,7 +7945,6 @@
       <w:pPr>
         <w:spacing w:before="0" w:after="0" w:line="240" w:lineRule="auto"/>
       </w:pPr>
-      <w:rPr/>
       <w:tblPr/>
       <w:tcPr>
         <w:tcBorders>
@@ -7880,7 +8090,6 @@
       <w:pPr>
         <w:spacing w:before="0" w:after="0" w:line="240" w:lineRule="auto"/>
       </w:pPr>
-      <w:rPr/>
       <w:tblPr/>
       <w:tcPr>
         <w:tcBorders>
@@ -8026,7 +8235,6 @@
       <w:pPr>
         <w:spacing w:before="0" w:after="0" w:line="240" w:lineRule="auto"/>
       </w:pPr>
-      <w:rPr/>
       <w:tblPr/>
       <w:tcPr>
         <w:tcBorders>
@@ -8172,7 +8380,6 @@
       <w:pPr>
         <w:spacing w:before="0" w:after="0" w:line="240" w:lineRule="auto"/>
       </w:pPr>
-      <w:rPr/>
       <w:tblPr/>
       <w:tcPr>
         <w:tcBorders>
@@ -8318,7 +8525,6 @@
       <w:pPr>
         <w:spacing w:before="0" w:after="0" w:line="240" w:lineRule="auto"/>
       </w:pPr>
-      <w:rPr/>
       <w:tblPr/>
       <w:tcPr>
         <w:tcBorders>

</xml_diff>

<commit_message>
feat: add more screenshots
</commit_message>
<xml_diff>
--- a/lab-1/Звіт_Лаб1_ІМ-55_Присяжний.docx
+++ b/lab-1/Звіт_Лаб1_ІМ-55_Присяжний.docx
@@ -2243,6 +2243,55 @@
           <w:b/>
           <w:sz w:val="28"/>
         </w:rPr>
+      </w:r>
+    </w:p>
+    <w:p>
+      <w:pPr>
+        <w:pStyle w:val="Normal"/>
+        <w:spacing w:before="0" w:after="120"/>
+        <w:rPr>
+          <w:b/>
+          <w:sz w:val="28"/>
+        </w:rPr>
+      </w:pPr>
+      <w:r>
+        <w:rPr>
+          <w:b/>
+          <w:sz w:val="28"/>
+        </w:rPr>
+        <w:tab/>
+      </w:r>
+    </w:p>
+    <w:p>
+      <w:pPr>
+        <w:pStyle w:val="Normal"/>
+        <w:spacing w:before="0" w:after="120"/>
+        <w:rPr>
+          <w:b/>
+          <w:sz w:val="28"/>
+        </w:rPr>
+      </w:pPr>
+      <w:r>
+        <w:rPr>
+          <w:b/>
+          <w:sz w:val="28"/>
+        </w:rPr>
+      </w:r>
+    </w:p>
+    <w:p>
+      <w:pPr>
+        <w:pStyle w:val="Normal"/>
+        <w:spacing w:before="0" w:after="120"/>
+        <w:rPr>
+          <w:b/>
+          <w:sz w:val="28"/>
+        </w:rPr>
+      </w:pPr>
+      <w:r>
+        <w:rPr>
+          <w:b/>
+          <w:sz w:val="28"/>
+        </w:rPr>
         <w:drawing>
           <wp:anchor distT="0" distB="0" distL="0" distR="0" simplePos="0" relativeHeight="4" behindDoc="0" locked="0" layoutInCell="0" allowOverlap="1">
             <wp:simplePos x="0" y="0"/>
@@ -2255,7 +2304,7 @@
             <wp:extent cx="6336665" cy="4525645"/>
             <wp:effectExtent l="0" t="0" r="0" b="0"/>
             <wp:wrapSquare wrapText="largest"/>
-            <wp:docPr id="3" name="Image2"/>
+            <wp:docPr id="3" name="Image5"/>
             <wp:cNvGraphicFramePr>
               <a:graphicFrameLocks xmlns:a="http://schemas.openxmlformats.org/drawingml/2006/main" noChangeAspect="1"/>
             </wp:cNvGraphicFramePr>
@@ -2263,7 +2312,7 @@
               <a:graphicData uri="http://schemas.openxmlformats.org/drawingml/2006/picture">
                 <pic:pic xmlns:pic="http://schemas.openxmlformats.org/drawingml/2006/picture">
                   <pic:nvPicPr>
-                    <pic:cNvPr id="3" name="Image2"/>
+                    <pic:cNvPr id="3" name="Image5"/>
                     <pic:cNvPicPr>
                       <a:picLocks noChangeAspect="1" noChangeArrowheads="1"/>
                     </pic:cNvPicPr>
@@ -2289,6 +2338,22 @@
             </a:graphic>
           </wp:anchor>
         </w:drawing>
+      </w:r>
+    </w:p>
+    <w:p>
+      <w:pPr>
+        <w:pStyle w:val="Normal"/>
+        <w:spacing w:before="0" w:after="120"/>
+        <w:rPr>
+          <w:b/>
+          <w:sz w:val="28"/>
+        </w:rPr>
+      </w:pPr>
+      <w:r>
+        <w:rPr>
+          <w:b/>
+          <w:sz w:val="28"/>
+        </w:rPr>
         <w:drawing>
           <wp:anchor distT="0" distB="0" distL="0" distR="0" simplePos="0" relativeHeight="5" behindDoc="0" locked="0" layoutInCell="0" allowOverlap="1">
             <wp:simplePos x="0" y="0"/>
@@ -2301,7 +2366,7 @@
             <wp:extent cx="6336665" cy="4525645"/>
             <wp:effectExtent l="0" t="0" r="0" b="0"/>
             <wp:wrapSquare wrapText="largest"/>
-            <wp:docPr id="4" name="Image3"/>
+            <wp:docPr id="4" name="Image2"/>
             <wp:cNvGraphicFramePr>
               <a:graphicFrameLocks xmlns:a="http://schemas.openxmlformats.org/drawingml/2006/main" noChangeAspect="1"/>
             </wp:cNvGraphicFramePr>
@@ -2309,7 +2374,7 @@
               <a:graphicData uri="http://schemas.openxmlformats.org/drawingml/2006/picture">
                 <pic:pic xmlns:pic="http://schemas.openxmlformats.org/drawingml/2006/picture">
                   <pic:nvPicPr>
-                    <pic:cNvPr id="4" name="Image3"/>
+                    <pic:cNvPr id="4" name="Image2"/>
                     <pic:cNvPicPr>
                       <a:picLocks noChangeAspect="1" noChangeArrowheads="1"/>
                     </pic:cNvPicPr>
@@ -2335,6 +2400,22 @@
             </a:graphic>
           </wp:anchor>
         </w:drawing>
+      </w:r>
+    </w:p>
+    <w:p>
+      <w:pPr>
+        <w:pStyle w:val="Normal"/>
+        <w:spacing w:before="0" w:after="120"/>
+        <w:rPr>
+          <w:b/>
+          <w:sz w:val="28"/>
+        </w:rPr>
+      </w:pPr>
+      <w:r>
+        <w:rPr>
+          <w:b/>
+          <w:sz w:val="28"/>
+        </w:rPr>
         <w:drawing>
           <wp:anchor distT="0" distB="0" distL="0" distR="0" simplePos="0" relativeHeight="6" behindDoc="0" locked="0" layoutInCell="0" allowOverlap="1">
             <wp:simplePos x="0" y="0"/>
@@ -2347,7 +2428,7 @@
             <wp:extent cx="6336665" cy="4525645"/>
             <wp:effectExtent l="0" t="0" r="0" b="0"/>
             <wp:wrapSquare wrapText="largest"/>
-            <wp:docPr id="5" name="Image4"/>
+            <wp:docPr id="5" name="Image3"/>
             <wp:cNvGraphicFramePr>
               <a:graphicFrameLocks xmlns:a="http://schemas.openxmlformats.org/drawingml/2006/main" noChangeAspect="1"/>
             </wp:cNvGraphicFramePr>
@@ -2355,7 +2436,7 @@
               <a:graphicData uri="http://schemas.openxmlformats.org/drawingml/2006/picture">
                 <pic:pic xmlns:pic="http://schemas.openxmlformats.org/drawingml/2006/picture">
                   <pic:nvPicPr>
-                    <pic:cNvPr id="5" name="Image4"/>
+                    <pic:cNvPr id="5" name="Image3"/>
                     <pic:cNvPicPr>
                       <a:picLocks noChangeAspect="1" noChangeArrowheads="1"/>
                     </pic:cNvPicPr>
@@ -2381,13 +2462,6 @@
             </a:graphic>
           </wp:anchor>
         </w:drawing>
-      </w:r>
-      <w:r>
-        <w:rPr>
-          <w:b/>
-          <w:sz w:val="28"/>
-        </w:rPr>
-        <w:tab/>
       </w:r>
     </w:p>
     <w:p>

</xml_diff>